<commit_message>
Reescrever o resumo com foco clínico e preencher as autoras
O corpo passa a descrever o protocolo de condicionamento e manejo em vez da
estratégia de busca: as citações no texto saíram e as referências ficaram
concentradas na seção própria, no formato ABNT, seguindo o modelo de resumo
usado pela turma. Inclui autora, coautora e orientadora, e uma referência
nacional sobre atendimento odontológico de crianças com TEA.

265 palavras no corpo, dentro do limite de 270 do formulário.

Co-Authored-By: Claude Opus 5 <noreply@anthropic.com>
Claude-Session: https://claude.ai/code/session_01KV9dw4gzFi44p1bVc4t4nV
</commit_message>
<xml_diff>
--- a/resumo-banner-pne/Resumo_Banner_PNE_TEA_TDAH_TAG.docx
+++ b/resumo-banner-pne/Resumo_Banner_PNE_TEA_TDAH_TAG.docx
@@ -13,13 +13,55 @@
           <w:b/>
           <w:sz w:val="28"/>
         </w:rPr>
-        <w:t>MANEJO ODONTOLÓGICO DE CRIANÇA COM TRANSTORNO DO ESPECTRO AUTISTA NÍVEL 3, TDAH E TRANSTORNO DE ANSIEDADE GENERALIZADA: REVISÃO DE LITERATURA</w:t>
+        <w:t>MANEJO ODONTOLÓGICO DE PACIENTE COM TRANSTORNO DO ESPECTRO AUTISTA NÍVEL 3, TDAH E TRANSTORNO DE ANSIEDADE GENERALIZADA</w:t>
+      </w:r>
+    </w:p>
+    <w:p>
+      <w:pPr>
+        <w:spacing w:line="360" w:lineRule="auto" w:before="0" w:after="0"/>
+        <w:jc w:val="center"/>
+      </w:pPr>
+      <w:r>
+        <w:rPr>
+          <w:rFonts w:ascii="Arial" w:hAnsi="Arial" w:cs="Arial"/>
+          <w:b w:val="0"/>
+          <w:sz w:val="28"/>
+        </w:rPr>
+        <w:t>AUTORA: THAMYRES TOSARELLI</w:t>
+      </w:r>
+    </w:p>
+    <w:p>
+      <w:pPr>
+        <w:spacing w:line="360" w:lineRule="auto" w:before="0" w:after="0"/>
+        <w:jc w:val="center"/>
+      </w:pPr>
+      <w:r>
+        <w:rPr>
+          <w:rFonts w:ascii="Arial" w:hAnsi="Arial" w:cs="Arial"/>
+          <w:b w:val="0"/>
+          <w:sz w:val="28"/>
+        </w:rPr>
+        <w:t>CO-AUTORA: BEATRIZ GOUVEA</w:t>
+      </w:r>
+    </w:p>
+    <w:p>
+      <w:pPr>
+        <w:spacing w:line="360" w:lineRule="auto" w:before="0" w:after="0"/>
+        <w:jc w:val="center"/>
+      </w:pPr>
+      <w:r>
+        <w:rPr>
+          <w:rFonts w:ascii="Arial" w:hAnsi="Arial" w:cs="Arial"/>
+          <w:b w:val="0"/>
+          <w:sz w:val="28"/>
+        </w:rPr>
+        <w:t>ORIENTADORA: PROFA. DRA. ROSEMARY MARTINS</w:t>
       </w:r>
     </w:p>
     <w:p>
       <w:pPr>
         <w:spacing w:line="240" w:lineRule="auto" w:before="0" w:after="0"/>
-        <w:jc w:val="center"/>
+        <w:jc w:val="left"/>
       </w:pPr>
       <w:r>
         <w:rPr>
@@ -27,49 +69,6 @@
           <w:b w:val="0"/>
           <w:sz w:val="24"/>
         </w:rPr>
-        <w:t>Autor: [NOME COMPLETO DO AUTOR PRINCIPAL]</w:t>
-      </w:r>
-    </w:p>
-    <w:p>
-      <w:pPr>
-        <w:spacing w:line="240" w:lineRule="auto" w:before="0" w:after="0"/>
-        <w:jc w:val="center"/>
-      </w:pPr>
-      <w:r>
-        <w:rPr>
-          <w:rFonts w:ascii="Arial" w:hAnsi="Arial" w:cs="Arial"/>
-          <w:b w:val="0"/>
-          <w:sz w:val="24"/>
-        </w:rPr>
-        <w:t>Coautores: [NOME 2]; [NOME 3]; [NOME 4]; [NOME 5]</w:t>
-      </w:r>
-    </w:p>
-    <w:p>
-      <w:pPr>
-        <w:spacing w:line="240" w:lineRule="auto" w:before="0" w:after="240"/>
-        <w:jc w:val="center"/>
-      </w:pPr>
-      <w:r>
-        <w:rPr>
-          <w:rFonts w:ascii="Arial" w:hAnsi="Arial" w:cs="Arial"/>
-          <w:b w:val="0"/>
-          <w:sz w:val="24"/>
-        </w:rPr>
-        <w:t>Orientadora: Profa. [NOME COMPLETO DA ORIENTADORA]</w:t>
-      </w:r>
-    </w:p>
-    <w:p>
-      <w:pPr>
-        <w:spacing w:line="360" w:lineRule="auto" w:before="0" w:after="120"/>
-        <w:jc w:val="left"/>
-      </w:pPr>
-      <w:r>
-        <w:rPr>
-          <w:rFonts w:ascii="Arial" w:hAnsi="Arial" w:cs="Arial"/>
-          <w:b/>
-          <w:sz w:val="24"/>
-        </w:rPr>
-        <w:t>RESUMO</w:t>
       </w:r>
     </w:p>
     <w:p>
@@ -83,12 +82,12 @@
           <w:b w:val="0"/>
           <w:sz w:val="24"/>
         </w:rPr>
-        <w:t>O Transtorno do Espectro Autista (TEA) nível 3 caracteriza-se por déficits graves na comunicação social, comportamentos restritos e repetitivos e alterações do processamento sensorial, associando-se com frequência ao Transtorno de Déficit de Atenção e Hiperatividade (TDAH) e ao Transtorno de Ansiedade Generalizada (TAG); a sobreposição dessas condições intensifica a não colaboração e dificulta o atendimento odontológico. Objetivou-se revisar a literatura sobre manejo comportamental e cuidado bucal nesse perfil de paciente, motivada pelo atendimento de uma criança de oito anos com essa tríade diagnóstica, pouco colaborativa, atendida na Clínica de Pacientes com Necessidades Especiais. Realizou-se revisão narrativa da literatura nas bases PubMed, SciELO e BVS/LILACS, com publicações entre 2015 e 2025, utilizando os descritores Transtorno do Espectro Autista, Assistência Odontológica para Pessoas com Deficiências, Transtorno do Déficit de Atenção com Hiperatividade e Ansiedade ao Tratamento Odontológico. Os estudos evidenciam maior risco de cárie nesses pacientes, por higiene bucal deficiente, seletividade alimentar cariogênica e xerostomia medicamentosa (DRUMOND et al., 2022). Entre as estratégias não farmacológicas, a pedagogia visual melhora a cooperação e a higiene bucal (BALIAN et al., 2021), enquanto a dessensibilização progressiva, o dizer-mostrar-fazer, a modelagem por vídeo e o reforço positivo apresentam resultados favoráveis, apesar da heterogeneidade metodológica (ALBHAISI et al., 2022). A adaptação sensorial do ambiente reduz o estresse fisiológico e comportamental (CERMAK et al., 2015; STEIN DUKER et al., 2023). Contenção protetora, sedação e anestesia geral permanecem reservadas à falha do manejo básico, mediante consentimento informado (AAPD, 2024). Conclui-se que não há protocolo universal: individualização, previsibilidade, capacitação profissional, vínculo com a família e ênfase preventiva determinam o sucesso do atendimento.</w:t>
+        <w:t>O Transtorno do Espectro Autista (TEA) nível 3 exige suporte muito substancial e cursa com comunicação limitada, comportamentos repetitivos e alterações sensoriais; quando associado ao Transtorno de Déficit de Atenção e Hiperatividade (TDAH) e ao Transtorno de Ansiedade Generalizada (TAG), somam-se desatenção, impulsividade e antecipação ansiosa, reduzindo a colaboração na cadeira odontológica. Esses pacientes apresentam maior risco de cárie e doença periodontal, por higiene bucal dependente do cuidador, seletividade alimentar cariogênica, bruxismo e hipossalivação induzida por psicofármacos. Objetiva-se descrever as estratégias de condicionamento e manejo clínico indicadas para essa associação e a conduta adotada com uma paciente de oito anos, pouco colaborativa, atendida na Clínica de Pacientes com Necessidades Especiais da UNIP. Será apresentado um banner com revisão de literatura aplicada ao caso clínico. O protocolo inicia-se pela anamnese ampliada com a responsável, identificando rotina, comunicação e gatilhos sensoriais, seguida de consultas curtas, em horário fixo, no mesmo box e com a mesma equipe. Aplicam-se dessensibilização progressiva, dizer-mostrar-fazer adaptado, pedagogia visual com pranchas e agenda de figuras, modelagem por vídeo e reforço positivo imediato, com redução de luz, ruído e odores e permanência do cuidador. A literatura demonstra que a pedagogia visual aumenta a cooperação e a escovação, e que o ambiente sensorialmente adaptado reduz o estresse fisiológico e comportamental. Espera-se ampliar a tolerância ao exame, viabilizando adequação do meio bucal, verniz fluoretado e controle periódico, reservando estabilização protetora, sedação e anestesia geral à falha do manejo básico. Conclui-se que individualização, previsibilidade, capacitação da equipe e vínculo com a família são determinantes do sucesso, e que a ênfase preventiva reduz a necessidade de intervenções avançadas.</w:t>
       </w:r>
     </w:p>
     <w:p>
       <w:pPr>
-        <w:spacing w:line="360" w:lineRule="auto" w:before="0" w:after="240"/>
+        <w:spacing w:line="360" w:lineRule="auto" w:before="0" w:after="360"/>
         <w:jc w:val="both"/>
       </w:pPr>
       <w:r>
@@ -108,10 +107,24 @@
       <w:r>
         <w:rPr>
           <w:rFonts w:ascii="Arial" w:hAnsi="Arial" w:cs="Arial"/>
-          <w:b/>
+          <w:b w:val="0"/>
+          <w:sz w:val="28"/>
+        </w:rPr>
+        <w:t>REFERÊNCIAS BIBLIOGRÁFICAS</w:t>
+      </w:r>
+    </w:p>
+    <w:p>
+      <w:pPr>
+        <w:spacing w:line="240" w:lineRule="auto" w:before="0" w:after="120"/>
+        <w:jc w:val="both"/>
+      </w:pPr>
+      <w:r>
+        <w:rPr>
+          <w:rFonts w:ascii="Arial" w:hAnsi="Arial" w:cs="Arial"/>
+          <w:b w:val="0"/>
           <w:sz w:val="24"/>
         </w:rPr>
-        <w:t>REFERÊNCIAS</w:t>
+        <w:t>ALBHAISI, Ismail Nabil et al. Effectiveness of psychological techniques in dental management for children with autism spectrum disorder: a systematic literature review. BMC Oral Health, Londres, v. 22, 2022. DOI: 10.1186/s12903-022-02200-7.</w:t>
       </w:r>
     </w:p>
     <w:p>
@@ -139,7 +152,7 @@
           <w:b w:val="0"/>
           <w:sz w:val="24"/>
         </w:rPr>
-        <w:t>ALBHAISI, I. N. et al. Effectiveness of psychological techniques in dental management for children with autism spectrum disorder: a systematic literature review. BMC Oral Health, v. 22, 2022. DOI: 10.1186/s12903-022-02200-7.</w:t>
+        <w:t>BALIAN, Araxi et al. Is visual pedagogy effective in improving cooperation towards oral hygiene and dental care in children with autism spectrum disorder? A systematic review and meta-analysis. International Journal of Environmental Research and Public Health, Basileia, v. 18, n. 2, p. 789, 2021.</w:t>
       </w:r>
     </w:p>
     <w:p>
@@ -153,7 +166,7 @@
           <w:b w:val="0"/>
           <w:sz w:val="24"/>
         </w:rPr>
-        <w:t>BALIAN, A. et al. Is visual pedagogy effective in improving cooperation towards oral hygiene and dental care in children with autism spectrum disorder? A systematic review and meta-analysis. International Journal of Environmental Research and Public Health, v. 18, n. 2, p. 789, 2021.</w:t>
+        <w:t>BEZERRA, R. C.; ASSIS, J. A.; SANTOS, P. U. O atendimento odontológico à crianças com Transtorno do Espectro Autista: uma revisão de literatura. Brazilian Journal of Health Review, Curitiba, v. 6, n. 3, p. 13155-13171, 2023.</w:t>
       </w:r>
     </w:p>
     <w:p>
@@ -167,7 +180,7 @@
           <w:b w:val="0"/>
           <w:sz w:val="24"/>
         </w:rPr>
-        <w:t>CERMAK, S. A. et al. Sensory adapted dental environments to enhance oral care for children with autism spectrum disorders: a randomized controlled pilot study. Journal of Autism and Developmental Disorders, v. 45, n. 9, p. 2876-2888, 2015.</w:t>
+        <w:t>CERMAK, Sharon A. et al. Sensory adapted dental environments to enhance oral care for children with autism spectrum disorders: a randomized controlled pilot study. Journal of Autism and Developmental Disorders, Nova York, v. 45, n. 9, p. 2876-2888, 2015.</w:t>
       </w:r>
     </w:p>
     <w:p>
@@ -181,7 +194,7 @@
           <w:b w:val="0"/>
           <w:sz w:val="24"/>
         </w:rPr>
-        <w:t>DRUMOND, V. Z. et al. Dental caries in children with attention deficit/hyperactivity disorder: a meta-analysis. Caries Research, v. 56, n. 1, p. 3-14, 2022.</w:t>
+        <w:t>DRUMOND, Victor Zanetti et al. Dental caries in children with attention deficit/hyperactivity disorder: a meta-analysis. Caries Research, Basileia, v. 56, n. 1, p. 3-14, 2022.</w:t>
       </w:r>
     </w:p>
     <w:p>
@@ -195,7 +208,7 @@
           <w:b w:val="0"/>
           <w:sz w:val="24"/>
         </w:rPr>
-        <w:t>STEIN DUKER, L. I. et al. Sensory adaptations to improve physiological and behavioral distress during dental visits in autistic children: a randomized crossover trial. JAMA Network Open, v. 6, n. 6, e2316346, 2023.</w:t>
+        <w:t>STEIN DUKER, Leah I. et al. Sensory adaptations to improve physiological and behavioral distress during dental visits in autistic children: a randomized crossover trial. JAMA Network Open, Chicago, v. 6, n. 6, e2316346, 2023.</w:t>
       </w:r>
     </w:p>
     <w:sectPr>

</xml_diff>

<commit_message>
Generalizar o resumo para o manejo recomendado na literatura
O texto descrevia o que seria feito com a paciente e anunciava a confecção do
banner, sendo que o próprio resumo é o do banner. Agora apresenta o
condicionamento como a literatura recomenda que seja conduzido, em linguagem
mais direta, e o título ganhou o subtítulo de revisão de literatura.

267 palavras no corpo, dentro do limite de 270 do formulário.

Co-Authored-By: Claude Opus 5 <noreply@anthropic.com>
Claude-Session: https://claude.ai/code/session_01KV9dw4gzFi44p1bVc4t4nV
</commit_message>
<xml_diff>
--- a/resumo-banner-pne/Resumo_Banner_PNE_TEA_TDAH_TAG.docx
+++ b/resumo-banner-pne/Resumo_Banner_PNE_TEA_TDAH_TAG.docx
@@ -13,7 +13,7 @@
           <w:b/>
           <w:sz w:val="28"/>
         </w:rPr>
-        <w:t>MANEJO ODONTOLÓGICO DE PACIENTE COM TRANSTORNO DO ESPECTRO AUTISTA NÍVEL 3, TDAH E TRANSTORNO DE ANSIEDADE GENERALIZADA</w:t>
+        <w:t>MANEJO ODONTOLÓGICO DO PACIENTE COM TRANSTORNO DO ESPECTRO AUTISTA NÍVEL 3, TDAH E TRANSTORNO DE ANSIEDADE GENERALIZADA: REVISÃO DE LITERATURA</w:t>
       </w:r>
     </w:p>
     <w:p>
@@ -82,7 +82,7 @@
           <w:b w:val="0"/>
           <w:sz w:val="24"/>
         </w:rPr>
-        <w:t>O Transtorno do Espectro Autista (TEA) nível 3 exige suporte muito substancial e cursa com comunicação limitada, comportamentos repetitivos e alterações sensoriais; quando associado ao Transtorno de Déficit de Atenção e Hiperatividade (TDAH) e ao Transtorno de Ansiedade Generalizada (TAG), somam-se desatenção, impulsividade e antecipação ansiosa, reduzindo a colaboração na cadeira odontológica. Esses pacientes apresentam maior risco de cárie e doença periodontal, por higiene bucal dependente do cuidador, seletividade alimentar cariogênica, bruxismo e hipossalivação induzida por psicofármacos. Objetiva-se descrever as estratégias de condicionamento e manejo clínico indicadas para essa associação e a conduta adotada com uma paciente de oito anos, pouco colaborativa, atendida na Clínica de Pacientes com Necessidades Especiais da UNIP. Será apresentado um banner com revisão de literatura aplicada ao caso clínico. O protocolo inicia-se pela anamnese ampliada com a responsável, identificando rotina, comunicação e gatilhos sensoriais, seguida de consultas curtas, em horário fixo, no mesmo box e com a mesma equipe. Aplicam-se dessensibilização progressiva, dizer-mostrar-fazer adaptado, pedagogia visual com pranchas e agenda de figuras, modelagem por vídeo e reforço positivo imediato, com redução de luz, ruído e odores e permanência do cuidador. A literatura demonstra que a pedagogia visual aumenta a cooperação e a escovação, e que o ambiente sensorialmente adaptado reduz o estresse fisiológico e comportamental. Espera-se ampliar a tolerância ao exame, viabilizando adequação do meio bucal, verniz fluoretado e controle periódico, reservando estabilização protetora, sedação e anestesia geral à falha do manejo básico. Conclui-se que individualização, previsibilidade, capacitação da equipe e vínculo com a família são determinantes do sucesso, e que a ênfase preventiva reduz a necessidade de intervenções avançadas.</w:t>
+        <w:t>O Transtorno do Espectro Autista (TEA) nível 3 é o que exige maior suporte, com comunicação verbal limitada, comportamentos repetitivos e alterações sensoriais. Com frequência vem acompanhado do Transtorno de Déficit de Atenção e Hiperatividade (TDAH) e do Transtorno de Ansiedade Generalizada (TAG), o que dificulta ainda mais o atendimento odontológico. Esses pacientes costumam apresentar maior risco de cárie e de doença periodontal, já que a higiene bucal depende do cuidador, a dieta costuma ser seletiva e cariogênica e os psicofármacos reduzem o fluxo salivar. O objetivo deste trabalho é descrever como deve ser conduzido o condicionamento desses pacientes para torná-los mais colaborativos no consultório. Trata-se de uma revisão de literatura, com artigos publicados entre 2015 e 2025. O manejo começa por uma anamnese detalhada com o responsável, que informa a rotina da criança, como ela se comunica e os estímulos que causam desconforto. Recomenda-se agendar consultas curtas, no mesmo horário, na mesma sala e com a mesma equipe, para que a criança encontre um ambiente previsível. O condicionamento deve ser gradual, por dessensibilização, associada ao dizer-mostrar-fazer, ao uso de pranchas e agendas de figuras, a vídeos que mostram o procedimento antes da consulta e ao reforço positivo a cada etapa cumprida. Diminuir a luz, o ruído e os odores e permitir a presença do cuidador também reduzem o estresse. A contenção protetora, a sedação e a anestesia geral ficam reservadas aos casos em que o manejo básico não é suficiente. Conclui-se que não existe um protocolo único: o atendimento precisa ser individualizado, construído junto com a família, e a ênfase na prevenção evita procedimentos mais invasivos.</w:t>
       </w:r>
     </w:p>
     <w:p>

</xml_diff>

<commit_message>
Ajustar o resumo de TEA ao limite de 260 palavras com o título incluído
O corpo cai para 231 palavras, o que dá 251 somado ao título, por compressão de
redação nas frases de risco de cárie, objetivo, anamnese e agendamento.

Autores passam a ocupar uma linha única, em caixa normal, no mesmo formato da
linha dos orientadores.

Co-Authored-By: Claude Opus 5 <noreply@anthropic.com>
Claude-Session: https://claude.ai/code/session_01KV9dw4gzFi44p1bVc4t4nV
</commit_message>
<xml_diff>
--- a/resumo-banner-pne/Resumo_Banner_PNE_TEA_TDAH_TAG.docx
+++ b/resumo-banner-pne/Resumo_Banner_PNE_TEA_TDAH_TAG.docx
@@ -27,7 +27,7 @@
           <w:b w:val="0"/>
           <w:sz w:val="28"/>
         </w:rPr>
-        <w:t>AUTORA: THAMYRES TOSARELLI</w:t>
+        <w:t>Autores: Thamyres Tosarelli e Beatriz Gouvea</w:t>
       </w:r>
     </w:p>
     <w:p>
@@ -41,21 +41,7 @@
           <w:b w:val="0"/>
           <w:sz w:val="28"/>
         </w:rPr>
-        <w:t>CO-AUTORA: BEATRIZ GOUVEA</w:t>
-      </w:r>
-    </w:p>
-    <w:p>
-      <w:pPr>
-        <w:spacing w:line="360" w:lineRule="auto" w:before="0" w:after="0"/>
-        <w:jc w:val="center"/>
-      </w:pPr>
-      <w:r>
-        <w:rPr>
-          <w:rFonts w:ascii="Arial" w:hAnsi="Arial" w:cs="Arial"/>
-          <w:b w:val="0"/>
-          <w:sz w:val="28"/>
-        </w:rPr>
-        <w:t>ORIENTADORES: ROSEMARY BAPTISTA MARTINS TEIXEIRA E RICARDO MATSURA KODAMA</w:t>
+        <w:t>Orientadores: Rosemary Baptista Martins Teixeira e Ricardo Matsura Kodama</w:t>
       </w:r>
     </w:p>
     <w:p>
@@ -82,7 +68,7 @@
           <w:b w:val="0"/>
           <w:sz w:val="24"/>
         </w:rPr>
-        <w:t>O Transtorno do Espectro Autista (TEA) nível 3 exige maior suporte, com comunicação verbal limitada, comportamentos repetitivos e alterações sensoriais. Com frequência vem acompanhado do Transtorno de Déficit de Atenção e Hiperatividade (TDAH) e do Transtorno de Ansiedade Generalizada (TAG), o que dificulta ainda mais o atendimento odontológico. Esses pacientes costumam apresentar maior risco de cárie e de doença periodontal, já que a higiene bucal depende do cuidador, a dieta costuma ser seletiva e cariogênica e os psicofármacos reduzem o fluxo salivar. O objetivo deste trabalho é descrever como deve ser conduzido o condicionamento desses pacientes para torná-los mais colaborativos. O manejo começa por uma anamnese detalhada com o responsável, que informa a rotina da criança, como ela se comunica e os estímulos que causam desconforto. Recomenda-se agendar consultas curtas, no mesmo horário, na mesma sala e com a mesma equipe, para que a criança encontre um ambiente previsível. A primeira consulta deve ser apenas de adaptação, sem procedimento clínico. O condicionamento deve ser gradual, por dessensibilização, associada ao dizer-mostrar-fazer, ao uso de pranchas e agendas de figuras, a vídeos que mostram o procedimento antes da consulta e ao reforço positivo a cada etapa cumprida. Diminuir a luz, o ruído e os odores e manter o cuidador presente também reduzem o estresse. A contenção protetora, a sedação e a anestesia geral ficam reservadas aos casos em que o manejo básico não basta. Conclui-se que não existe um protocolo único: o atendimento precisa ser individualizado, construído junto com a família, e a ênfase na prevenção evita procedimentos mais invasivos.</w:t>
+        <w:t>O Transtorno do Espectro Autista (TEA) nível 3 exige maior suporte, com comunicação verbal limitada, comportamentos repetitivos e alterações sensoriais. Com frequência vem acompanhado do Transtorno de Déficit de Atenção e Hiperatividade (TDAH) e do Transtorno de Ansiedade Generalizada (TAG), dificultando ainda mais o atendimento. Esses pacientes têm maior risco de cárie e doença periodontal, pois a higiene depende do cuidador, a dieta é seletiva e cariogênica e os psicofármacos reduzem o fluxo salivar. O objetivo é descrever como conduzir o condicionamento desses pacientes para torná-los mais colaborativos. O manejo começa por anamnese detalhada com o responsável, que informa a rotina, a forma de comunicação e os estímulos que causam desconforto. Recomenda-se agendar consultas curtas, no mesmo horário, sala e equipe, garantindo um ambiente previsível. A primeira consulta deve ser apenas de adaptação, sem procedimento clínico. O condicionamento deve ser gradual, por dessensibilização, associada ao dizer-mostrar-fazer, ao uso de pranchas e agendas de figuras, a vídeos que mostram o procedimento antes da consulta e ao reforço positivo a cada etapa cumprida. Diminuir luz, ruído e odores e manter o cuidador presente também reduz o estresse. A contenção protetora, a sedação e a anestesia geral ficam reservadas aos casos em que o manejo básico não basta. Conclui-se que não existe um protocolo único: o atendimento precisa ser individualizado, construído junto com a família, e a ênfase na prevenção evita procedimentos mais invasivos.</w:t>
       </w:r>
     </w:p>
     <w:p>

</xml_diff>